<commit_message>
Improve subtitle clarity in chrononutrition trend document
https://claude.ai/code/session_015dvxDeVpW1fYN1DVAPrAGn
</commit_message>
<xml_diff>
--- a/tendencia_crononutricao_proteica.docx
+++ b/tendencia_crononutricao_proteica.docx
@@ -46,7 +46,15 @@
           <w:color w:val="5A5A5A"/>
           <w:sz w:val="22"/>
         </w:rPr>
-        <w:t>Como a ciência dos ritmos circadianos revelou que quando você consome proteína importa tanto quanto quanto você consome, e por que isso vai criar uma categoria de suplementação que ainda não existe</w:t>
+      </w:r>
+      <w:r>
+        <w:rPr>
+          <w:rFonts w:ascii="Arial" w:hAnsi="Arial" w:cs="Arial"/>
+          <w:i/>
+          <w:color w:val="5A5A5A"/>
+          <w:sz w:val="22"/>
+        </w:rPr>
+        <w:t>A ciência dos ritmos circadianos demonstrou que o horário em que a proteína é consumida altera o resultado fisiológico de forma mensurável. O produto capaz de entregar essa precisão ao consumidor ainda não existe.</w:t>
       </w:r>
     </w:p>
     <w:p>

</xml_diff>

<commit_message>
Simplify language in chrononutrition document for easier presentation
https://claude.ai/code/session_015dvxDeVpW1fYN1DVAPrAGn
</commit_message>
<xml_diff>
--- a/tendencia_crononutricao_proteica.docx
+++ b/tendencia_crononutricao_proteica.docx
@@ -46,14 +46,6 @@
           <w:color w:val="5A5A5A"/>
           <w:sz w:val="22"/>
         </w:rPr>
-      </w:r>
-      <w:r>
-        <w:rPr>
-          <w:rFonts w:ascii="Arial" w:hAnsi="Arial" w:cs="Arial"/>
-          <w:i/>
-          <w:color w:val="5A5A5A"/>
-          <w:sz w:val="22"/>
-        </w:rPr>
         <w:t>A ciência dos ritmos circadianos demonstrou que o horário em que a proteína é consumida altera o resultado fisiológico de forma mensurável. O produto capaz de entregar essa precisão ao consumidor ainda não existe.</w:t>
       </w:r>
     </w:p>
@@ -69,7 +61,7 @@
           <w:i w:val="0"/>
           <w:sz w:val="22"/>
         </w:rPr>
-        <w:t>Desde que o mercado de suplementação proteica se consolidou, a grande obsessão da indústria foi a dose. Quanto de proteína por quilo de peso corporal? Quantas gramas por refeição? Quantas doses por dia? O quando ficou em segundo plano, reduzido a uma recomendação genérica de "tomar após o treino". O problema é que essa simplificação ignora uma camada inteira da biologia muscular: o músculo tem um relógio interno. E esse relógio determina, com precisão molecular, em que momentos do dia o tecido muscular está programado para construir proteína e em que momentos está programado para degradá-la. A crononutrição proteica é a tendência que emerge da convergência entre a biologia circadiana, a nutrição esportiva e a tecnologia de monitoramento contínuo, e ela aponta para uma conclusão que ainda não chegou às prateleiras de suplementos: o horário de consumo da proteína é uma variável ativa no resultado, não um detalhe logístico.</w:t>
+        <w:t>A indústria de suplementos sempre perguntou quanto de proteína tomar. Nunca perguntou quando. A recomendação padrão de "tomar após o treino" virou regra sem que ninguém questionasse a fundo o que acontece com a proteína em outros horários do dia. O que a ciência descobriu é que o músculo tem um relógio interno. Esse relógio define, hora a hora, quando o músculo está no modo de construção e quando está no modo de degradação. Ignorar esse relógio é como regar uma planta de noite achando que vai dar o mesmo resultado. A crononutrição proteica parte exatamente dessa descoberta: o horário em que você consome a proteína não é um detalhe, é uma variável que muda o resultado.</w:t>
       </w:r>
     </w:p>
     <w:p>
@@ -84,7 +76,7 @@
           <w:i w:val="0"/>
           <w:sz w:val="22"/>
         </w:rPr>
-        <w:t>A base molecular dessa afirmação foi estabelecida ao longo da última década, mas ganhou resolução científica significativa em estudos publicados entre 2024 e 2025. O músculo esquelético possui um relógio periférico autônomo, regulado por proteínas chamadas genes do relógio, sendo o BMAL1 o principal ativador transcricional desse sistema. Um estudo publicado nos Proceedings of the National Academy of Sciences (PNAS) em 2025 demonstrou que o relógio circadiano periférico do músculo controla ativamente a degradação proteica noturna por meio do equilíbrio entre as proteínas ROR e REV-ERB. Quando esse relógio funciona corretamente, ele suprime a autofagia muscular nas horas que antecedem o despertar, protegendo a massa construída durante o dia. Quando é perturbado, por alimentação fora de fase, privação de sono ou padrões irregulares de treino, o músculo degrada proteína em momentos nos quais deveria preservá-la. Outro estudo publicado no PNAS no mesmo ano demonstrou que a sinalização mTOR, via central da síntese proteica muscular, apresenta pico de sensibilidade durante a fase ativa do organismo, quando a insulina e os hormônios anabólicos estão em maior concentração plasmática. Consumir proteína fora dessa janela não equivale, necessariamente, a consumir proteína com o mesmo resultado.</w:t>
+        <w:t>O músculo possui genes específicos que funcionam como um relógio, controlando o ritmo de construção e quebra de proteína ao longo do dia. O principal deles é o BMAL1. Quando esse gene está ativo, o organismo entra em modo anabólico: constrói, repara e preserva o tecido muscular. Um estudo publicado nos Proceedings of the National Academy of Sciences em 2025 mostrou que esse relógio muscular também suprime ativamente a degradação de proteína nas horas que antecedem o despertar, funcionando como uma proteção natural da massa construída durante o dia. O mesmo estudo mostrou que quando esse ritmo é quebrado, seja por sono irregular, alimentação fora de hora ou treinos desalinhados com o ciclo biológico, o músculo começa a degradar proteína em momentos em que deveria preservá-la. Ou seja, não basta consumir proteína suficiente. O organismo precisa recebê-la no momento em que está preparado para usá-la.</w:t>
       </w:r>
     </w:p>
     <w:p>
@@ -99,7 +91,7 @@
           <w:i w:val="0"/>
           <w:sz w:val="22"/>
         </w:rPr>
-        <w:t>Os ensaios clínicos que investigaram o efeito do horário de consumo proteico sobre a composição corporal revelam um cenário mais complexo do que a recomendação genérica sugere. Uma meta-análise publicada no PMC em 2025, que revisou sistematicamente ensaios sobre timing proteico e adaptações ao exercício, identificou que o efeito do horário é modulado pelo cronótipo individual, pelo momento do treino em relação ao ciclo circadiano e pelo tipo de proteína consumida. Em um estudo publicado na Frontiers in Nutrition (2024) com homens treinados em resistência, diferentes distribuições temporais da proteína diária produziram resultados distintos em composição corporal e performance muscular, mesmo com ingestão total idêntica. Estudos anteriores já haviam demonstrado que consumo de 20 a 30 gramas de proteína à noite produzia maior massa magra nos membros inferiores em comparação ao consumo da mesma quantidade à tarde. Outros, porém, mostraram que maior proporção do total proteico consumida pela manhã estava associada a melhor força de preensão e preservação de massa muscular em adultos mais velhos. O que os dados não mostram é um protocolo universal. O que mostram é que o horário importa, e que a variável moduladora é o relógio biológico de cada indivíduo.</w:t>
+        <w:t>Os estudos que testaram horários diferentes de consumo proteico chegaram a resultados que surpreendem. Uma meta-análise publicada em 2025 reuniu ensaios clínicos sobre timing de proteína e mostrou que o mesmo total diário de proteína produz resultados diferentes dependendo de quando é distribuído ao longo do dia. Pessoas que consumiram de 20 a 30 gramas de proteína à noite ganharam mais massa muscular nas pernas do que as que consumiram a mesma quantidade à tarde. Por outro lado, consumir uma proporção maior de proteína pela manhã esteve associado a melhor força e preservação muscular em adultos mais velhos. O ponto central não é que existe um horário único e certo para todo mundo, mas o oposto: o horário ideal é individual, e ele depende do ritmo circadiano de cada pessoa. É exatamente essa personalização que ainda não chegou ao mercado de suplementos.</w:t>
       </w:r>
     </w:p>
     <w:p>
@@ -114,7 +106,7 @@
           <w:i w:val="0"/>
           <w:sz w:val="22"/>
         </w:rPr>
-        <w:t>O motivo pelo qual essa descoberta ainda não gerou uma categoria de produto é técnico: até recentemente, não havia forma acessível de identificar em que fase circadiana um consumidor específico se encontra no momento em que considera tomar seu suplemento. O cronótipo, a tendência biológica de cada pessoa para ser matutina ou vespertina, é apenas uma aproximação grosseira do estado circadiano real, que varia com a estação do ano, padrões de sono, exposição à luz e histórico recente de alimentação. Determinar com precisão a janela anabólica circadiana de um indivíduo exige monitoramento contínuo de biomarcadores como temperatura corporal periférica, cortisol e melatonina, que são justamente os dados que wearables de nova geração, como anéis inteligentes e monitores contínuos de glicose, passaram a capturar em escala comercial a partir de 2024 e 2025. É essa convergência tecnológica que abre a janela para a crononutrição proteica como categoria real de produto, e não apenas como protocolo experimental de laboratório.</w:t>
+        <w:t>A razão pela qual ainda não existe nenhum produto de suplementação construído em torno do horário biológico é simples: até pouco tempo atrás, não havia como saber, de forma prática e contínua, em que fase do ciclo circadiano uma pessoa se encontrava. Identificar o cronótipo, se a pessoa é mais matutina ou vespertina, é apenas uma aproximação grosseira. O estado circadiano real muda com o sono, a luz, o estresse e a alimentação do dia anterior. Medir isso com precisão exige acompanhamento contínuo de indicadores como temperatura corporal, frequência cardíaca e padrão de sono. Esses são exatamente os dados que wearables como anéis inteligentes e relógios de monitoramento contínuo passaram a capturar de forma acessível a partir de 2024 e 2025. A tecnologia que faltava para tornar a crononutrição proteica um produto real está chegando ao mercado agora.</w:t>
       </w:r>
     </w:p>
     <w:p>
@@ -129,7 +121,7 @@
           <w:i w:val="0"/>
           <w:sz w:val="22"/>
         </w:rPr>
-        <w:t>O cenário que se projeta para o horizonte 2027-2035 é o de suplementos proteicos que não existem para serem tomados em horário fixo, mas em horário recomendado. Um aplicativo conectado ao wearable do usuário identifica, a partir dos dados de temperatura corporal, variabilidade de frequência cardíaca e padrão de sono, em que fase do ritmo circadiano o organismo se encontra, e envia uma notificação indicando a janela ideal para consumo da proteína. A formulação pode variar conforme o horário: proteína de absorção rápida, como o whey isolado enriquecido com leucina, para momentos de pico anabólico durante a fase ativa; proteína de absorção lenta, como a caseína micelar, para o período pré-sono, aproveitando o mecanismo natural de supressão da degradação muscular noturna descrito nos estudos do PNAS. O mercado global de nutrição personalizada, avaliado em USD 15,80 bilhões em 2025 e projetado para USD 60,92 bilhões até 2035 pela GlobeNewswire, e o mercado de wearables, estimado em USD 101,8 bilhões em 2025, formam juntos o substrato econômico sobre o qual essa categoria emergirá. Nenhuma empresa lançou ainda um produto estruturado em torno do cronótipo e do ritmo circadiano como variável principal de prescrição proteica. Esse espaço está vazio.</w:t>
+        <w:t>O que se projeta para os próximos anos é uma categoria de suplemento que não tem horário fixo de consumo, mas horário recomendado pelo seu próprio perfil biológico. O aplicativo conectado ao wearable identifica em que fase do ritmo circadiano o organismo está e indica quando tomar a proteína e qual tipo: whey de absorção rápida nos momentos de pico anabólico durante o dia, caseína de absorção lenta antes de dormir, para aproveitar o mecanismo natural de proteção muscular durante o sono. O mercado de nutrição personalizada, que vale USD 15,80 bilhões em 2025 e deve chegar a USD 60,92 bilhões até 2035, e o mercado de wearables, estimado em USD 101,8 bilhões em 2025, formam juntos a base econômica sobre a qual essa categoria vai se desenvolver. Nenhuma empresa lançou ainda um produto estruturado dessa forma. Esse espaço está vazio.</w:t>
       </w:r>
     </w:p>
     <w:p>
@@ -144,7 +136,7 @@
           <w:i w:val="0"/>
           <w:sz w:val="22"/>
         </w:rPr>
-        <w:t>A implicação mais profunda da crononutrição proteica não é técnica: é conceitual. Ela propõe que o ingrediente ativo de um suplemento proteico não é apenas o aminograma da proteína, mas também o momento em que ela encontra o músculo. Isso muda o que uma marca de suplementos precisa entregar ao consumidor: não apenas uma formulação, mas um protocolo temporizado, integrado aos dados biológicos do usuário e ajustado continuamente conforme seu padrão de sono, treino e exposição à luz. O setor que primeiro transformar essa cadeia, da biologia circadiana ao produto na prateleira com instrução de horário individualizada, criará uma categoria de suplementação que não pode ser replicada por um concorrente que vende apenas pó em um pote. A pergunta que define o próximo capítulo da suplementação proteica não é mais "qual proteína tomar", mas "quando o seu corpo está pronto para recebê-la".</w:t>
+        <w:t>A crononutrição proteica muda uma crença central do mercado de suplementos: a de que o que importa é o que está dentro do pote. Essa tendência propõe que o ingrediente ativo não é só a proteína, mas também o momento em que ela encontra o músculo. Isso transforma o suplemento em um protocolo, não em um produto isolado. E protocolos personalizados são muito mais difíceis de copiar do que fórmulas. A marca que primeiro traduzir a biologia circadiana em uma experiência de consumo prática, com indicação de horário baseada nos dados do usuário, não estará apenas vendendo proteína. Estará criando uma categoria inteira. A pergunta que vai definir o próximo capítulo da suplementação proteica não é mais qual proteína tomar, mas quando o seu corpo está pronto para recebê-la.</w:t>
       </w:r>
     </w:p>
     <w:p>

</xml_diff>